<commit_message>
Adding test run and test plan reports
</commit_message>
<xml_diff>
--- a/templates/report_main.docx
+++ b/templates/report_main.docx
@@ -107,8 +107,11 @@
       </w:r>
     </w:p>
     <w:p>
-      <w:r>
-        <w:t>## Executive Summary</w:t>
+      <w:pPr>
+        <w:pStyle w:val="Heading2"/>
+      </w:pPr>
+      <w:r>
+        <w:t>Executive Summary</w:t>
       </w:r>
     </w:p>
     <w:p>
@@ -126,6 +129,12 @@
         <w:t>{% endif %}</w:t>
       </w:r>
     </w:p>
+    <w:p>
+      <w:r>
+        <w:br w:type="page"/>
+      </w:r>
+    </w:p>
+    <w:p/>
     <w:sectPr>
       <w:pgSz w:w="12240" w:h="15840"/>
       <w:pgMar w:top="1440" w:right="1440" w:bottom="1440" w:left="1440" w:header="720" w:footer="720" w:gutter="0"/>
@@ -564,7 +573,6 @@
     <w:next w:val="Normal"/>
     <w:link w:val="Heading2Char"/>
     <w:uiPriority w:val="9"/>
-    <w:semiHidden/>
     <w:unhideWhenUsed/>
     <w:qFormat/>
     <w:rsid w:val="002902FD"/>
@@ -781,7 +789,6 @@
     <w:basedOn w:val="DefaultParagraphFont"/>
     <w:link w:val="Heading2"/>
     <w:uiPriority w:val="9"/>
-    <w:semiHidden/>
     <w:rsid w:val="002902FD"/>
     <w:rPr>
       <w:rFonts w:asciiTheme="majorHAnsi" w:eastAsiaTheme="majorEastAsia" w:hAnsiTheme="majorHAnsi" w:cstheme="majorBidi"/>

</xml_diff>